<commit_message>
First working Receipt Label
</commit_message>
<xml_diff>
--- a/src/ReportExtensions/DraftInvoiceWithCurrency.docx
+++ b/src/ReportExtensions/DraftInvoiceWithCurrency.docx
@@ -6258,6 +6258,7 @@
              < E x t e n s i o n V e r s i o n > E x t e n s i o n   V e r s i o n < / E x t e n s i o n V e r s i o n > 
              < R e p o r t I d > R e p o r t   I D < / R e p o r t I d > 
              < R e p o r t N a m e > R e p o r t   N a m e < / R e p o r t N a m e > 
+             < R e p o r t C a p t i o n > R e p o r t   C a p t i o n < / R e p o r t C a p t i o n > 
              < A b o u t T h i s R e p o r t T i t l e > A b o u t   T h i s   R e p o r t   T i t l e < / A b o u t T h i s R e p o r t T i t l e > 
              < A b o u t T h i s R e p o r t T e x t > A b o u t   T h i s   R e p o r t   T e x t < / A b o u t T h i s R e p o r t T e x t > 
              < R e p o r t H e l p L i n k > R e p o r t   H e l p   L i n k < / R e p o r t H e l p L i n k > 
@@ -6281,6 +6282,45 @@
                  < M i n u t e > M i n u t e < / M i n u t e > 
              < / D a t e T i m e V a l u e s > 
          < / R e p o r t R e q u e s t > 
+         < C o m p a n y M e t a d a t a > 
+             < C o m p a n y N a m e > C o m p a n y   N a m e < / C o m p a n y N a m e > 
+             < C o m p a n y D i s p l a y N a m e > C o m p a n y   D i s p l a y   N a m e < / C o m p a n y D i s p l a y N a m e > 
+             < C o m p a n y A d d r e s s L i n e s > 
+                 < C o m p a n y A d d r e s s L i n e 1 > C o m p a n y   A d d r e s s   L i n e   1 < / C o m p a n y A d d r e s s L i n e 1 > 
+                 < C o m p a n y A d d r e s s L i n e 2 > C o m p a n y   A d d r e s s   L i n e   2 < / C o m p a n y A d d r e s s L i n e 2 > 
+                 < C o m p a n y A d d r e s s L i n e 3 > C o m p a n y   A d d r e s s   L i n e   3 < / C o m p a n y A d d r e s s L i n e 3 > 
+                 < C o m p a n y A d d r e s s L i n e 4 > C o m p a n y   A d d r e s s   L i n e   4 < / C o m p a n y A d d r e s s L i n e 4 > 
+                 < C o m p a n y A d d r e s s L i n e 5 > C o m p a n y   A d d r e s s   L i n e   5 < / C o m p a n y A d d r e s s L i n e 5 > 
+                 < C o m p a n y A d d r e s s L i n e 6 > C o m p a n y   A d d r e s s   L i n e   6 < / C o m p a n y A d d r e s s L i n e 6 > 
+                 < C o m p a n y A d d r e s s L i n e 7 > C o m p a n y   A d d r e s s   L i n e   7 < / C o m p a n y A d d r e s s L i n e 7 > 
+                 < C o m p a n y A d d r e s s L i n e 8 > C o m p a n y   A d d r e s s   L i n e   8 < / C o m p a n y A d d r e s s L i n e 8 > 
+             < / C o m p a n y A d d r e s s L i n e s > 
+             < C o m p a n y P h o n e > C o m p a n y   P h o n e < / C o m p a n y P h o n e > 
+             < C o m p a n y P h o n e C a p t i o n > C o m p a n y   P h o n e   C a p t i o n < / C o m p a n y P h o n e C a p t i o n > 
+             < C o m p a n y F a x N o > C o m p a n y   F a x   N o . < / C o m p a n y F a x N o > 
+             < C o m p a n y F a x N o C a p t i o n > C o m p a n y   F a x   N o .   C a p t i o n < / C o m p a n y F a x N o C a p t i o n > 
+             < C o m p a n y E m a i l > C o m p a n y   E m a i l < / C o m p a n y E m a i l > 
+             < C o m p a n y E m a i l C a p t i o n > C o m p a n y   E m a i l   C a p t i o n < / C o m p a n y E m a i l C a p t i o n > 
+             < C o m p a n y H o m e P a g e > C o m p a n y   H o m e   P a g e < / C o m p a n y H o m e P a g e > 
+             < C o m p a n y H o m e P a g e C a p t i o n > C o m p a n y   H o m e   P a g e   C a p t i o n < / C o m p a n y H o m e P a g e C a p t i o n > 
+             < C o m p a n y L o g o > C o m p a n y   L o g o < / C o m p a n y L o g o > 
+             < C o m p a n y V A T R e g i s t r a t i o n N o > C o m p a n y   V A T   R e g i s t r a t i o n   N o . < / C o m p a n y V A T R e g i s t r a t i o n N o > 
+             < C o m p a n y V A T R e g i s t r a t i o n N o C a p t i o n > C o m p a n y   V A T   R e g i s t r a t i o n   N o .   C a p t i o n < / C o m p a n y V A T R e g i s t r a t i o n N o C a p t i o n > 
+             < C o m p a n y R e g i s t r a t i o n N o > C o m p a n y   R e g i s t r a t i o n   N o . < / C o m p a n y R e g i s t r a t i o n N o > 
+             < C o m p a n y R e g i s t r a t i o n N o C a p t i o n > C o m p a n y   R e g i s t r a t i o n   N o .   C a p t i o n < / C o m p a n y R e g i s t r a t i o n N o C a p t i o n > 
+             < C o m p a n y B a n k N a m e > C o m p a n y   B a n k   N a m e < / C o m p a n y B a n k N a m e > 
+             < C o m p a n y B a n k N a m e C a p t i o n > C o m p a n y   B a n k   N a m e   C a p t i o n < / C o m p a n y B a n k N a m e C a p t i o n > 
+             < C o m p a n y B a n k A c c o u n t N o > C o m p a n y   B a n k   A c c o u n t   N o . < / C o m p a n y B a n k A c c o u n t N o > 
+             < C o m p a n y B a n k A c c o u n t N o C a p t i o n > C o m p a n y   B a n k   A c c o u n t   N o .   C a p t i o n < / C o m p a n y B a n k A c c o u n t N o C a p t i o n > 
+             < C o m p a n y B a n k B r a n c h N o > C o m p a n y   B a n k   B r a n c h   N o . < / C o m p a n y B a n k B r a n c h N o > 
+             < C o m p a n y B a n k B r a n c h N o C a p t i o n > C o m p a n y   B a n k   B r a n c h   N o .   C a p t i o n < / C o m p a n y B a n k B r a n c h N o C a p t i o n > 
+             < C o m p a n y I B A N > C o m p a n y   I B A N < / C o m p a n y I B A N > 
+             < C o m p a n y I B A N C a p t i o n > C o m p a n y   I B A N   C a p t i o n < / C o m p a n y I B A N C a p t i o n > 
+             < C o m p a n y B a n k S W I F T > C o m p a n y   B a n k   S W I F T < / C o m p a n y B a n k S W I F T > 
+             < C o m p a n y B a n k S W I F T C a p t i o n > C o m p a n y   B a n k   S W I F T   C a p t i o n < / C o m p a n y B a n k S W I F T C a p t i o n > 
+             < C o m p a n y G i r o N o > C o m p a n y   G i r o   N o . < / C o m p a n y G i r o N o > 
+             < C o m p a n y G i r o N o C a p t i o n > C o m p a n y   G i r o   N o .   C a p t i o n < / C o m p a n y G i r o N o C a p t i o n > 
+         < / C o m p a n y M e t a d a t a > 
      < / B C R e p o r t I n f o r m a t i o n > 
      < H e a d e r > 
          < B i l l e d T o _ L b l > B i l l e d T o _ L b l < / B i l l e d T o _ L b l > 
@@ -6528,6 +6568,327 @@
  < / N a v W o r d R e p o r t X m l P a r t > 
 </file>
 
+<file path=customXml/item3.xml>��< ? x m l   v e r s i o n = " 1 . 0 "   e n c o d i n g = " u t f - 1 6 " ? > 
+ < N a v W o r d R e p o r t X m l P a r t   x m l n s = " u r n : m i c r o s o f t - d y n a m i c s - b u s i n e s s c e n t r a l / i n t e r n a l / e x t e n d e d / r e p o r t s / S t a n d a r d _ S a l e s _ D r a f t _ I n v o i c e / 1 3 0 3 / " > 
+     < B C R e p o r t I n f o r m a t i o n > 
+         < R e p o r t M e t a d a t a > 
+             < E x t e n s i o n I d > E x t e n s i o n   I D < / E x t e n s i o n I d > 
+             < E x t e n s i o n N a m e > E x t e n s i o n   N a m e < / E x t e n s i o n N a m e > 
+             < E x t e n s i o n P u b l i s h e r > E x t e n s i o n   P u b l i s h e r < / E x t e n s i o n P u b l i s h e r > 
+             < E x t e n s i o n V e r s i o n > E x t e n s i o n   V e r s i o n < / E x t e n s i o n V e r s i o n > 
+             < R e p o r t I d > R e p o r t   I D < / R e p o r t I d > 
+             < R e p o r t N a m e > R e p o r t   N a m e < / R e p o r t N a m e > 
+             < R e p o r t C a p t i o n > R e p o r t   C a p t i o n < / R e p o r t C a p t i o n > 
+             < A b o u t T h i s R e p o r t T i t l e > A b o u t   T h i s   R e p o r t   T i t l e < / A b o u t T h i s R e p o r t T i t l e > 
+             < A b o u t T h i s R e p o r t T e x t > A b o u t   T h i s   R e p o r t   T e x t < / A b o u t T h i s R e p o r t T e x t > 
+             < R e p o r t H e l p L i n k > R e p o r t   H e l p   L i n k < / R e p o r t H e l p L i n k > 
+         < / R e p o r t M e t a d a t a > 
+         < R e p o r t R e q u e s t > 
+             < T e n a n t E n t r a I d > T e n a n t   E n t r a   I d < / T e n a n t E n t r a I d > 
+             < E n v i r o n m e n t N a m e > E n v i r o n m e n t   N a m e < / E n v i r o n m e n t N a m e > 
+             < E n v i r o n m e n t T y p e > E n v i r o n m e n t   T y p e < / E n v i r o n m e n t T y p e > 
+             < C o m p a n y N a m e > C o m p a n y   N a m e < / C o m p a n y N a m e > 
+             < C o m p a n y D i s p l a y N a m e > C o m p a n y   D i s p l a y   N a m e < / C o m p a n y D i s p l a y N a m e > 
+             < C o m p a n y I d > C o m p a n y   I D < / C o m p a n y I d > 
+             < U s e r N a m e > U s e r   N a m e < / U s e r N a m e > 
+             < D a t e A n d T i m e > D a t e   a n d   T i m e < / D a t e A n d T i m e > 
+             < L a n g u a g e > L a n g u a g e < / L a n g u a g e > 
+             < F o r m a t R e g i o n > F o r m a t   R e g i o n < / F o r m a t R e g i o n > 
+             < D a t e T i m e V a l u e s > 
+                 < Y e a r > Y e a r < / Y e a r > 
+                 < M o n t h N u m b e r > M o n t h   N u m b e r < / M o n t h N u m b e r > 
+                 < D a y N u m b e r > D a y   N u m b e r < / D a y N u m b e r > 
+                 < H o u r > H o u r < / H o u r > 
+                 < M i n u t e > M i n u t e < / M i n u t e > 
+             < / D a t e T i m e V a l u e s > 
+         < / R e p o r t R e q u e s t > 
+         < C o m p a n y M e t a d a t a > 
+             < C o m p a n y N a m e > C o m p a n y   N a m e < / C o m p a n y N a m e > 
+             < C o m p a n y D i s p l a y N a m e > C o m p a n y   D i s p l a y   N a m e < / C o m p a n y D i s p l a y N a m e > 
+             < C o m p a n y A d d r e s s L i n e s > 
+                 < C o m p a n y A d d r e s s L i n e 1 > C o m p a n y   A d d r e s s   L i n e   1 < / C o m p a n y A d d r e s s L i n e 1 > 
+                 < C o m p a n y A d d r e s s L i n e 2 > C o m p a n y   A d d r e s s   L i n e   2 < / C o m p a n y A d d r e s s L i n e 2 > 
+                 < C o m p a n y A d d r e s s L i n e 3 > C o m p a n y   A d d r e s s   L i n e   3 < / C o m p a n y A d d r e s s L i n e 3 > 
+                 < C o m p a n y A d d r e s s L i n e 4 > C o m p a n y   A d d r e s s   L i n e   4 < / C o m p a n y A d d r e s s L i n e 4 > 
+                 < C o m p a n y A d d r e s s L i n e 5 > C o m p a n y   A d d r e s s   L i n e   5 < / C o m p a n y A d d r e s s L i n e 5 > 
+                 < C o m p a n y A d d r e s s L i n e 6 > C o m p a n y   A d d r e s s   L i n e   6 < / C o m p a n y A d d r e s s L i n e 6 > 
+                 < C o m p a n y A d d r e s s L i n e 7 > C o m p a n y   A d d r e s s   L i n e   7 < / C o m p a n y A d d r e s s L i n e 7 > 
+                 < C o m p a n y A d d r e s s L i n e 8 > C o m p a n y   A d d r e s s   L i n e   8 < / C o m p a n y A d d r e s s L i n e 8 > 
+             < / C o m p a n y A d d r e s s L i n e s > 
+             < C o m p a n y P h o n e > C o m p a n y   P h o n e < / C o m p a n y P h o n e > 
+             < C o m p a n y P h o n e C a p t i o n > C o m p a n y   P h o n e   C a p t i o n < / C o m p a n y P h o n e C a p t i o n > 
+             < C o m p a n y F a x N o > C o m p a n y   F a x   N o . < / C o m p a n y F a x N o > 
+             < C o m p a n y F a x N o C a p t i o n > C o m p a n y   F a x   N o .   C a p t i o n < / C o m p a n y F a x N o C a p t i o n > 
+             < C o m p a n y E m a i l > C o m p a n y   E m a i l < / C o m p a n y E m a i l > 
+             < C o m p a n y E m a i l C a p t i o n > C o m p a n y   E m a i l   C a p t i o n < / C o m p a n y E m a i l C a p t i o n > 
+             < C o m p a n y H o m e P a g e > C o m p a n y   H o m e   P a g e < / C o m p a n y H o m e P a g e > 
+             < C o m p a n y H o m e P a g e C a p t i o n > C o m p a n y   H o m e   P a g e   C a p t i o n < / C o m p a n y H o m e P a g e C a p t i o n > 
+             < C o m p a n y L o g o > C o m p a n y   L o g o < / C o m p a n y L o g o > 
+             < C o m p a n y V A T R e g i s t r a t i o n N o > C o m p a n y   V A T   R e g i s t r a t i o n   N o . < / C o m p a n y V A T R e g i s t r a t i o n N o > 
+             < C o m p a n y V A T R e g i s t r a t i o n N o C a p t i o n > C o m p a n y   V A T   R e g i s t r a t i o n   N o .   C a p t i o n < / C o m p a n y V A T R e g i s t r a t i o n N o C a p t i o n > 
+             < C o m p a n y R e g i s t r a t i o n N o > C o m p a n y   R e g i s t r a t i o n   N o . < / C o m p a n y R e g i s t r a t i o n N o > 
+             < C o m p a n y R e g i s t r a t i o n N o C a p t i o n > C o m p a n y   R e g i s t r a t i o n   N o .   C a p t i o n < / C o m p a n y R e g i s t r a t i o n N o C a p t i o n > 
+             < C o m p a n y B a n k N a m e > C o m p a n y   B a n k   N a m e < / C o m p a n y B a n k N a m e > 
+             < C o m p a n y B a n k N a m e C a p t i o n > C o m p a n y   B a n k   N a m e   C a p t i o n < / C o m p a n y B a n k N a m e C a p t i o n > 
+             < C o m p a n y B a n k A c c o u n t N o > C o m p a n y   B a n k   A c c o u n t   N o . < / C o m p a n y B a n k A c c o u n t N o > 
+             < C o m p a n y B a n k A c c o u n t N o C a p t i o n > C o m p a n y   B a n k   A c c o u n t   N o .   C a p t i o n < / C o m p a n y B a n k A c c o u n t N o C a p t i o n > 
+             < C o m p a n y B a n k B r a n c h N o > C o m p a n y   B a n k   B r a n c h   N o . < / C o m p a n y B a n k B r a n c h N o > 
+             < C o m p a n y B a n k B r a n c h N o C a p t i o n > C o m p a n y   B a n k   B r a n c h   N o .   C a p t i o n < / C o m p a n y B a n k B r a n c h N o C a p t i o n > 
+             < C o m p a n y I B A N > C o m p a n y   I B A N < / C o m p a n y I B A N > 
+             < C o m p a n y I B A N C a p t i o n > C o m p a n y   I B A N   C a p t i o n < / C o m p a n y I B A N C a p t i o n > 
+             < C o m p a n y B a n k S W I F T > C o m p a n y   B a n k   S W I F T < / C o m p a n y B a n k S W I F T > 
+             < C o m p a n y B a n k S W I F T C a p t i o n > C o m p a n y   B a n k   S W I F T   C a p t i o n < / C o m p a n y B a n k S W I F T C a p t i o n > 
+             < C o m p a n y G i r o N o > C o m p a n y   G i r o   N o . < / C o m p a n y G i r o N o > 
+             < C o m p a n y G i r o N o C a p t i o n > C o m p a n y   G i r o   N o .   C a p t i o n < / C o m p a n y G i r o N o C a p t i o n > 
+         < / C o m p a n y M e t a d a t a > 
+     < / B C R e p o r t I n f o r m a t i o n > 
+     < T o o l t i p s   / > 
+     < H e a d e r   E l e m e n t T y p e = " D a t a I t e m "   E l e m e n t I d = " 1 2 4 0 3 7 3 8 8 6 " > 
+         < B i l l e d T o _ L b l   E l e m e n t T y p e = " C o l u m n "   E l e m e n t I d = " 1 7 4 5 4 4 9 0 7 9 "   D a t a T y p e = " L a b e l " > B i l l e d T o _ L b l < / B i l l e d T o _ L b l > 
+         < B i l l T o C o n t a c t E m a i l   E l e m e n t T y p e = " C o l u m n "   E l e m e n t I d = " 3 3 5 8 2 7 8 9 5 "   D a t a T y p e = " T e x t " > B i l l T o C o n t a c t E m a i l < / B i l l T o C o n t a c t E m a i l > 
+         < B i l l T o C o n t a c t E m a i l L b l   E l e m e n t T y p e = " C o l u m n "   E l e m e n t I d = " 2 9 6 4 7 8 3 6 5 "   D a t a T y p e = " L a b e l " > B i l l T o C o n t a c t E m a i l L b l < / B i l l T o C o n t a c t E m a i l L b l > 
+         < B i l l T o C o n t a c t M o b i l e P h o n e N o   E l e m e n t T y p e = " C o l u m n "   E l e m e n t I d = " 2 4 8 4 8 8 6 9 6 "   D a t a T y p e = " T e x t " > B i l l T o C o n t a c t M o b i l e P h o n e N o < / B i l l T o C o n t a c t M o b i l e P h o n e N o > 
+         < B i l l T o C o n t a c t M o b i l e P h o n e N o L b l   E l e m e n t T y p e = " C o l u m n "   E l e m e n t I d = " 2 7 6 3 1 1 3 3 8 "   D a t a T y p e = " L a b e l " > B i l l T o C o n t a c t M o b i l e P h o n e N o L b l < / B i l l T o C o n t a c t M o b i l e P h o n e N o L b l > 
+         < B i l l T o C o n t a c t P h o n e N o   E l e m e n t T y p e = " C o l u m n "   E l e m e n t I d = " 3 6 2 4 7 7 4 8 8 "   D a t a T y p e = " T e x t " > B i l l T o C o n t a c t P h o n e N o < / B i l l T o C o n t a c t P h o n e N o > 
+         < B i l l T o C o n t a c t P h o n e N o L b l   E l e m e n t T y p e = " C o l u m n "   E l e m e n t I d = " 2 1 2 3 3 4 5 9 6 6 "   D a t a T y p e = " L a b e l " > B i l l T o C o n t a c t P h o n e N o L b l < / B i l l T o C o n t a c t P h o n e N o L b l > 
+         < B i l l t o C u s t o m e r N o _ L b l   E l e m e n t T y p e = " C o l u m n "   E l e m e n t I d = " 3 6 9 3 0 7 8 1 3 "   D a t a T y p e = " S t r i n g " > B i l l t o C u s t o m e r N o _ L b l < / B i l l t o C u s t o m e r N o _ L b l > 
+         < B i l l t o C u s t u m e r N o   E l e m e n t T y p e = " C o l u m n "   E l e m e n t I d = " 2 8 0 4 7 3 0 5 8 "   D a t a T y p e = " C o d e " > B i l l t o C u s t u m e r N o < / B i l l t o C u s t u m e r N o > 
+         < C h e c k s P a y a b l e _ L b l   E l e m e n t T y p e = " C o l u m n "   E l e m e n t I d = " 1 0 5 3 1 5 6 0 6 5 "   D a t a T y p e = " T e x t " > C h e c k s P a y a b l e _ L b l < / C h e c k s P a y a b l e _ L b l > 
+         < C o m p a n y A d d r e s s 1   E l e m e n t T y p e = " C o l u m n "   E l e m e n t I d = " 1 8 8 4 1 6 4 3 2 3 "   D a t a T y p e = " T e x t " > C o m p a n y A d d r e s s 1 < / C o m p a n y A d d r e s s 1 > 
+         < C o m p a n y A d d r e s s 2   E l e m e n t T y p e = " C o l u m n "   E l e m e n t I d = " 1 2 4 6 4 6 7 7 0 6 "   D a t a T y p e = " T e x t " > C o m p a n y A d d r e s s 2 < / C o m p a n y A d d r e s s 2 > 
+         < C o m p a n y A d d r e s s 3   E l e m e n t T y p e = " C o l u m n "   E l e m e n t I d = " 6 0 8 7 7 1 0 8 9 "   D a t a T y p e = " T e x t " > C o m p a n y A d d r e s s 3 < / C o m p a n y A d d r e s s 3 > 
+         < C o m p a n y A d d r e s s 4   E l e m e n t T y p e = " C o l u m n "   E l e m e n t I d = " 7 7 7 6 8 0 1 1 2 "   D a t a T y p e = " T e x t " > C o m p a n y A d d r e s s 4 < / C o m p a n y A d d r e s s 4 > 
+         < C o m p a n y A d d r e s s 5   E l e m e n t T y p e = " C o l u m n "   E l e m e n t I d = " 1 3 9 9 8 3 4 9 5 "   D a t a T y p e = " T e x t " > C o m p a n y A d d r e s s 5 < / C o m p a n y A d d r e s s 5 > 
+         < C o m p a n y A d d r e s s 6   E l e m e n t T y p e = " C o l u m n "   E l e m e n t I d = " 4 9 7 7 1 3 1 2 2 "   D a t a T y p e = " T e x t " > C o m p a n y A d d r e s s 6 < / C o m p a n y A d d r e s s 6 > 
+         < C o m p a n y A d d r e s s 7   E l e m e n t T y p e = " C o l u m n "   E l e m e n t I d = " 1 1 3 5 4 0 9 7 3 9 "   D a t a T y p e = " T e x t " > C o m p a n y A d d r e s s 7 < / C o m p a n y A d d r e s s 7 > 
+         < C o m p a n y A d d r e s s 8   E l e m e n t T y p e = " C o l u m n "   E l e m e n t I d = " 1 7 1 5 2 5 5 3 0 0 "   D a t a T y p e = " T e x t " > C o m p a n y A d d r e s s 8 < / C o m p a n y A d d r e s s 8 > 
+         < C o m p a n y B a n k A c c o u n t N o   E l e m e n t T y p e = " C o l u m n "   E l e m e n t I d = " 3 0 1 4 0 2 0 4 "   D a t a T y p e = " T e x t " > C o m p a n y B a n k A c c o u n t N o < / C o m p a n y B a n k A c c o u n t N o > 
+         < C o m p a n y B a n k A c c o u n t N o _ L b l   E l e m e n t T y p e = " C o l u m n "   E l e m e n t I d = " 1 0 9 7 7 4 3 3 4 5 "   D a t a T y p e = " L a b e l " > C o m p a n y B a n k A c c o u n t N o _ L b l < / C o m p a n y B a n k A c c o u n t N o _ L b l > 
+         < C o m p a n y B a n k B r a n c h N o   E l e m e n t T y p e = " C o l u m n "   E l e m e n t I d = " 7 9 3 1 3 3 0 5 7 "   D a t a T y p e = " T e x t " > C o m p a n y B a n k B r a n c h N o < / C o m p a n y B a n k B r a n c h N o > 
+         < C o m p a n y B a n k B r a n c h N o _ L b l   E l e m e n t T y p e = " C o l u m n "   E l e m e n t I d = " 3 2 7 9 0 6 6 9 2 "   D a t a T y p e = " S t r i n g " > C o m p a n y B a n k B r a n c h N o _ L b l < / C o m p a n y B a n k B r a n c h N o _ L b l > 
+         < C o m p a n y B a n k N a m e   E l e m e n t T y p e = " C o l u m n "   E l e m e n t I d = " 1 5 3 4 9 0 5 6 0 5 "   D a t a T y p e = " T e x t " > C o m p a n y B a n k N a m e < / C o m p a n y B a n k N a m e > 
+         < C o m p a n y B a n k N a m e _ L b l   E l e m e n t T y p e = " C o l u m n "   E l e m e n t I d = " 1 2 0 4 3 0 7 0 1 4 "   D a t a T y p e = " L a b e l " > C o m p a n y B a n k N a m e _ L b l < / C o m p a n y B a n k N a m e _ L b l > 
+         < C o m p a n y C u s t o m G i r o   E l e m e n t T y p e = " C o l u m n "   E l e m e n t I d = " 1 6 7 0 4 7 5 7 9 8 "   D a t a T y p e = " T e x t " > C o m p a n y C u s t o m G i r o < / C o m p a n y C u s t o m G i r o > 
+         < C o m p a n y C u s t o m G i r o _ L b l   E l e m e n t T y p e = " C o l u m n "   E l e m e n t I d = " 8 9 1 4 3 9 6 2 5 "   D a t a T y p e = " T e x t " > C o m p a n y C u s t o m G i r o _ L b l < / C o m p a n y C u s t o m G i r o _ L b l > 
+         < C o m p a n y E M a i l   E l e m e n t T y p e = " C o l u m n "   E l e m e n t I d = " 1 6 7 7 0 7 4 0 5 8 "   D a t a T y p e = " T e x t " > C o m p a n y E M a i l < / C o m p a n y E M a i l > 
+         < C o m p a n y G i r o N o   E l e m e n t T y p e = " C o l u m n "   E l e m e n t I d = " 1 3 6 0 1 9 6 3 2 0 "   D a t a T y p e = " T e x t " > C o m p a n y G i r o N o < / C o m p a n y G i r o N o > 
+         < C o m p a n y G i r o N o _ L b l   E l e m e n t T y p e = " C o l u m n "   E l e m e n t I d = " 8 6 1 6 0 2 1 1 5 "   D a t a T y p e = " L a b e l " > C o m p a n y G i r o N o _ L b l < / C o m p a n y G i r o N o _ L b l > 
+         < C o m p a n y H o m e P a g e   E l e m e n t T y p e = " C o l u m n "   E l e m e n t I d = " 1 9 8 9 1 8 8 7 0 "   D a t a T y p e = " T e x t " > C o m p a n y H o m e P a g e < / C o m p a n y H o m e P a g e > 
+         < C o m p a n y I B A N   E l e m e n t T y p e = " C o l u m n "   E l e m e n t I d = " 9 0 6 5 4 9 1 8 2 "   D a t a T y p e = " C o d e " > C o m p a n y I B A N < / C o m p a n y I B A N > 
+         < C o m p a n y I B A N _ L b l   E l e m e n t T y p e = " C o l u m n "   E l e m e n t I d = " 1 2 6 7 9 5 2 2 2 7 "   D a t a T y p e = " S t r i n g " > C o m p a n y I B A N _ L b l < / C o m p a n y I B A N _ L b l > 
+         < C o m p a n y L e g a l O f f i c e   E l e m e n t T y p e = " C o l u m n "   E l e m e n t I d = " 7 1 4 2 5 8 1 1 1 "   D a t a T y p e = " T e x t " > C o m p a n y L e g a l O f f i c e < / C o m p a n y L e g a l O f f i c e > 
+         < C o m p a n y L e g a l O f f i c e _ L b l   E l e m e n t T y p e = " C o l u m n "   E l e m e n t I d = " 1 5 3 3 1 7 5 1 0 8 "   D a t a T y p e = " T e x t " > C o m p a n y L e g a l O f f i c e _ L b l < / C o m p a n y L e g a l O f f i c e _ L b l > 
+         < C o m p a n y L e g a l S t a t e m e n t   E l e m e n t T y p e = " C o l u m n "   E l e m e n t I d = " 4 4 8 3 5 8 8 7 6 "   D a t a T y p e = " T e x t " > C o m p a n y L e g a l S t a t e m e n t < / C o m p a n y L e g a l S t a t e m e n t > 
+         < C o m p a n y L o g o P o s i t i o n   E l e m e n t T y p e = " C o l u m n "   E l e m e n t I d = " 1 4 2 5 2 6 6 6 8 8 "   D a t a T y p e = " I n t e g e r " > C o m p a n y L o g o P o s i t i o n < / C o m p a n y L o g o P o s i t i o n > 
+         < C o m p a n y P h o n e N o   E l e m e n t T y p e = " C o l u m n "   E l e m e n t I d = " 2 5 0 4 4 0 6 5 5 "   D a t a T y p e = " T e x t " > C o m p a n y P h o n e N o < / C o m p a n y P h o n e N o > 
+         < C o m p a n y P h o n e N o _ L b l   E l e m e n t T y p e = " C o l u m n "   E l e m e n t I d = " 5 5 8 5 9 3 5 8 6 "   D a t a T y p e = " L a b e l " > C o m p a n y P h o n e N o _ L b l < / C o m p a n y P h o n e N o _ L b l > 
+         < C o m p a n y P i c t u r e   E l e m e n t T y p e = " C o l u m n "   E l e m e n t I d = " 1 3 9 7 4 1 1 0 7 4 "   D a t a T y p e = " B l o b "   / > 
+         < C o m p a n y R e g i s t r a t i o n N u m b e r   E l e m e n t T y p e = " C o l u m n "   E l e m e n t I d = " 2 0 2 3 6 3 9 4 2 4 "   D a t a T y p e = " T e x t " > C o m p a n y R e g i s t r a t i o n N u m b e r < / C o m p a n y R e g i s t r a t i o n N u m b e r > 
+         < C o m p a n y R e g i s t r a t i o n N u m b e r _ L b l   E l e m e n t T y p e = " C o l u m n "   E l e m e n t I d = " 1 8 3 3 1 0 6 6 5 3 "   D a t a T y p e = " T e x t " > C o m p a n y R e g i s t r a t i o n N u m b e r _ L b l < / C o m p a n y R e g i s t r a t i o n N u m b e r _ L b l > 
+         < C o m p a n y S W I F T   E l e m e n t T y p e = " C o l u m n "   E l e m e n t I d = " 6 6 8 2 5 0 2 4 5 "   D a t a T y p e = " C o d e " > C o m p a n y S W I F T < / C o m p a n y S W I F T > 
+         < C o m p a n y S W I F T _ L b l   E l e m e n t T y p e = " C o l u m n "   E l e m e n t I d = " 2 0 2 9 5 9 7 3 8 4 "   D a t a T y p e = " S t r i n g " > C o m p a n y S W I F T _ L b l < / C o m p a n y S W I F T _ L b l > 
+         < C o m p a n y V A T R e g i s t r a t i o n N o   E l e m e n t T y p e = " C o l u m n "   E l e m e n t I d = " 1 9 1 4 0 1 3 6 4 9 "   D a t a T y p e = " T e x t " > C o m p a n y V A T R e g i s t r a t i o n N o < / C o m p a n y V A T R e g i s t r a t i o n N o > 
+         < C o m p a n y V A T R e g i s t r a t i o n N o _ L b l   E l e m e n t T y p e = " C o l u m n "   E l e m e n t I d = " 9 2 4 5 0 3 1 2 4 "   D a t a T y p e = " T e x t " > C o m p a n y V A T R e g i s t r a t i o n N o _ L b l < / C o m p a n y V A T R e g i s t r a t i o n N o _ L b l > 
+         < C o m p a n y V A T R e g N o   E l e m e n t T y p e = " C o l u m n "   E l e m e n t I d = " 1 7 1 4 3 1 9 3 6 "   D a t a T y p e = " T e x t " > C o m p a n y V A T R e g N o < / C o m p a n y V A T R e g N o > 
+         < C o m p a n y V A T R e g N o _ L b l   E l e m e n t T y p e = " C o l u m n "   E l e m e n t I d = " 7 7 3 2 0 1 5 0 1 "   D a t a T y p e = " T e x t " > C o m p a n y V A T R e g N o _ L b l < / C o m p a n y V A T R e g N o _ L b l > 
+         < C o n t a c t _ L b l   E l e m e n t T y p e = " C o l u m n "   E l e m e n t I d = " 1 1 5 5 0 9 4 7 5 2 "   D a t a T y p e = " T e x t " > C o n t a c t _ L b l < / C o n t a c t _ L b l > 
+         < C o p y _ L b l   E l e m e n t T y p e = " C o l u m n "   E l e m e n t I d = " 6 0 4 7 8 2 7 8 1 "   D a t a T y p e = " L a b e l " > C o p y _ L b l < / C o p y _ L b l > 
+         < C u r r e n c y C o d e   E l e m e n t T y p e = " C o l u m n "   E l e m e n t I d = " 1 5 7 9 5 9 5 9 2 1 "   D a t a T y p e = " C o d e " > C u r r e n c y C o d e < / C u r r e n c y C o d e > 
+         < C u r r e n c y C o d e _ L b l   E l e m e n t T y p e = " C o l u m n "   E l e m e n t I d = " 1 6 5 9 3 4 3 5 7 0 "   D a t a T y p e = " L a b e l " > C u r r e n c y C o d e _ L b l < / C u r r e n c y C o d e _ L b l > 
+         < C u s t o m e r A d d r e s s 1   E l e m e n t T y p e = " C o l u m n "   E l e m e n t I d = " 1 8 0 1 9 6 6 4 5 4 "   D a t a T y p e = " T e x t " > C u s t o m e r A d d r e s s 1 < / C u s t o m e r A d d r e s s 1 > 
+         < C u s t o m e r A d d r e s s 2   E l e m e n t T y p e = " C o l u m n "   E l e m e n t I d = " 1 1 6 4 2 6 9 8 3 7 "   D a t a T y p e = " T e x t " > C u s t o m e r A d d r e s s 2 < / C u s t o m e r A d d r e s s 2 > 
+         < C u s t o m e r A d d r e s s 3   E l e m e n t T y p e = " C o l u m n "   E l e m e n t I d = " 5 2 6 5 7 3 2 2 0 "   D a t a T y p e = " T e x t " > C u s t o m e r A d d r e s s 3 < / C u s t o m e r A d d r e s s 3 > 
+         < C u s t o m e r A d d r e s s 4   E l e m e n t T y p e = " C o l u m n "   E l e m e n t I d = " 1 1 1 1 2 3 3 9 7 "   D a t a T y p e = " T e x t " > C u s t o m e r A d d r e s s 4 < / C u s t o m e r A d d r e s s 4 > 
+         < C u s t o m e r A d d r e s s 5   E l e m e n t T y p e = " C o l u m n "   E l e m e n t I d = " 7 4 8 8 2 0 0 1 4 "   D a t a T y p e = " T e x t " > C u s t o m e r A d d r e s s 5 < / C u s t o m e r A d d r e s s 5 > 
+         < C u s t o m e r A d d r e s s 6   E l e m e n t T y p e = " C o l u m n "   E l e m e n t I d = " 1 3 8 6 5 1 6 6 3 1 "   D a t a T y p e = " T e x t " > C u s t o m e r A d d r e s s 6 < / C u s t o m e r A d d r e s s 6 > 
+         < C u s t o m e r A d d r e s s 7   E l e m e n t T y p e = " C o l u m n "   E l e m e n t I d = " 2 0 2 4 2 1 3 2 4 8 "   D a t a T y p e = " T e x t " > C u s t o m e r A d d r e s s 7 < / C u s t o m e r A d d r e s s 7 > 
+         < C u s t o m e r A d d r e s s 8   E l e m e n t T y p e = " C o l u m n "   E l e m e n t I d = " 1 0 4 8 6 9 8 5 8 5 "   D a t a T y p e = " T e x t " > C u s t o m e r A d d r e s s 8 < / C u s t o m e r A d d r e s s 8 > 
+         < C u s t o m e r P o s t a l B a r C o d e   E l e m e n t T y p e = " C o l u m n "   E l e m e n t I d = " 3 9 8 5 8 0 6 8 8 "   D a t a T y p e = " T e x t " > C u s t o m e r P o s t a l B a r C o d e < / C u s t o m e r P o s t a l B a r C o d e > 
+         < D o c u m e n t D a t e   E l e m e n t T y p e = " C o l u m n "   E l e m e n t I d = " 5 5 2 8 7 1 9 1 4 "   D a t a T y p e = " S t r i n g " > D o c u m e n t D a t e < / D o c u m e n t D a t e > 
+         < D o c u m e n t D a t e _ L b l   E l e m e n t T y p e = " C o l u m n "   E l e m e n t I d = " 1 0 2 6 4 9 4 8 3 "   D a t a T y p e = " S t r i n g " > D o c u m e n t D a t e _ L b l < / D o c u m e n t D a t e _ L b l > 
+         < D o c u m e n t N o   E l e m e n t T y p e = " C o l u m n "   E l e m e n t I d = " 9 7 0 3 5 0 5 3 9 "   D a t a T y p e = " C o d e " > D o c u m e n t N o < / D o c u m e n t N o > 
+         < D o c u m e n t N o _ L b l   E l e m e n t T y p e = " C o l u m n "   E l e m e n t I d = " 7 8 9 7 9 5 9 7 8 "   D a t a T y p e = " T e x t " > D o c u m e n t N o _ L b l < / D o c u m e n t N o _ L b l > 
+         < D o c u m e n t T i t l e _ L b l   E l e m e n t T y p e = " C o l u m n "   E l e m e n t I d = " 8 5 8 4 2 3 9 2 9 "   D a t a T y p e = " T e x t " > D o c u m e n t T i t l e _ L b l < / D o c u m e n t T i t l e _ L b l > 
+         < D u e D a t e   E l e m e n t T y p e = " C o l u m n "   E l e m e n t I d = " 7 4 5 1 7 0 2 0 3 "   D a t a T y p e = " S t r i n g " > D u e D a t e < / D u e D a t e > 
+         < D u e D a t e _ L b l   E l e m e n t T y p e = " C o l u m n "   E l e m e n t I d = " 1 6 4 8 2 8 4 6 4 8 "   D a t a T y p e = " S t r i n g " > D u e D a t e _ L b l < / D u e D a t e _ L b l > 
+         < E M a i l _ L b l   E l e m e n t T y p e = " C o l u m n "   E l e m e n t I d = " 1 4 3 8 8 6 8 0 1 2 "   D a t a T y p e = " L a b e l " > E M a i l _ L b l < / E M a i l _ L b l > 
+         < E x c h a n g e R a t e A s T e x t   E l e m e n t T y p e = " C o l u m n "   E l e m e n t I d = " 5 9 2 9 5 5 8 4 5 "   D a t a T y p e = " T e x t " > E x c h a n g e R a t e A s T e x t < / E x c h a n g e R a t e A s T e x t > 
+         < E x t e r n a l D o c u m e n t N o   E l e m e n t T y p e = " C o l u m n "   E l e m e n t I d = " 7 3 3 9 5 3 9 6 6 "   D a t a T y p e = " C o d e " > E x t e r n a l D o c u m e n t N o < / E x t e r n a l D o c u m e n t N o > 
+         < E x t e r n a l D o c u m e n t N o _ _ L b l   E l e m e n t T y p e = " C o l u m n "   E l e m e n t I d = " 2 2 3 4 3 3 3 2 "   D a t a T y p e = " S t r i n g " > E x t e r n a l D o c u m e n t N o _ _ L b l < / E x t e r n a l D o c u m e n t N o _ _ L b l > 
+         < F r o m _ L b l   E l e m e n t T y p e = " C o l u m n "   E l e m e n t I d = " 4 8 5 4 2 6 1 3 8 "   D a t a T y p e = " L a b e l " > F r o m _ L b l < / F r o m _ L b l > 
+         < H o m e P a g e _ L b l   E l e m e n t T y p e = " C o l u m n "   E l e m e n t I d = " 1 4 3 3 5 9 2 3 0 0 "   D a t a T y p e = " L a b e l " > H o m e P a g e _ L b l < / H o m e P a g e _ L b l > 
+         < I n v o i c e D i s c o u n t A m o u n t _ L b l   E l e m e n t T y p e = " C o l u m n "   E l e m e n t I d = " 1 5 9 3 0 1 2 7 3 6 "   D a t a T y p e = " L a b e l " > I n v o i c e D i s c o u n t A m o u n t _ L b l < / I n v o i c e D i s c o u n t A m o u n t _ L b l > 
+         < I n v o i c e D i s c o u n t B a s e A m o u n t _ L b l   E l e m e n t T y p e = " C o l u m n "   E l e m e n t I d = " 2 0 2 9 2 6 6 8 7 5 "   D a t a T y p e = " L a b e l " > I n v o i c e D i s c o u n t B a s e A m o u n t _ L b l < / I n v o i c e D i s c o u n t B a s e A m o u n t _ L b l > 
+         < I n v o i c e N o P o s i t i o n _ L b l   E l e m e n t T y p e = " C o l u m n "   E l e m e n t I d = " 1 4 5 8 4 6 7 4 4 1 "   D a t a T y p e = " T e x t " > I n v o i c e N o P o s i t i o n _ L b l < / I n v o i c e N o P o s i t i o n _ L b l > 
+         < L e g a l E n t i t y T y p e   E l e m e n t T y p e = " C o l u m n "   E l e m e n t I d = " 2 0 5 1 8 7 3 5 6 3 "   D a t a T y p e = " T e x t " > L e g a l E n t i t y T y p e < / L e g a l E n t i t y T y p e > 
+         < L e g a l E n t i t y T y p e _ L b l   E l e m e n t T y p e = " C o l u m n "   E l e m e n t I d = " 2 0 8 0 2 2 4 7 9 2 "   D a t a T y p e = " T e x t " > L e g a l E n t i t y T y p e _ L b l < / L e g a l E n t i t y T y p e _ L b l > 
+         < L i n e A m o u n t A f t e r I n v o i c e D i s c o u n t _ L b l   E l e m e n t T y p e = " C o l u m n "   E l e m e n t I d = " 6 7 3 7 2 1 0 9 4 "   D a t a T y p e = " L a b e l " > L i n e A m o u n t A f t e r I n v o i c e D i s c o u n t _ L b l < / L i n e A m o u n t A f t e r I n v o i c e D i s c o u n t _ L b l > 
+         < L o c a l C u r r e n c y _ L b l   E l e m e n t T y p e = " C o l u m n "   E l e m e n t I d = " 1 5 5 9 6 9 3 4 2 2 "   D a t a T y p e = " L a b e l " > L o c a l C u r r e n c y _ L b l < / L o c a l C u r r e n c y _ L b l > 
+         < P a g e _ L b l   E l e m e n t T y p e = " C o l u m n "   E l e m e n t I d = " 6 8 0 6 4 8 0 9 1 "   D a t a T y p e = " L a b e l " > P a g e _ L b l < / P a g e _ L b l > 
+         < P a y m e n t I n s t r u c t i o n s _ T x t   E l e m e n t T y p e = " C o l u m n "   E l e m e n t I d = " 1 8 7 2 0 8 8 3 "   D a t a T y p e = " T e x t " > P a y m e n t I n s t r u c t i o n s _ T x t < / P a y m e n t I n s t r u c t i o n s _ T x t > 
+         < P a y m e n t M e t h o d D e s c r i p t i o n   E l e m e n t T y p e = " C o l u m n "   E l e m e n t I d = " 5 8 5 7 5 7 9 7 4 "   D a t a T y p e = " T e x t " > P a y m e n t M e t h o d D e s c r i p t i o n < / P a y m e n t M e t h o d D e s c r i p t i o n > 
+         < P a y m e n t M e t h o d D e s c r i p t i o n _ L b l   E l e m e n t T y p e = " C o l u m n "   E l e m e n t I d = " 7 9 7 1 1 7 3 2 3 "   D a t a T y p e = " L a b e l " > P a y m e n t M e t h o d D e s c r i p t i o n _ L b l < / P a y m e n t M e t h o d D e s c r i p t i o n _ L b l > 
+         < P a y m e n t T e r m s D e s c r i p t i o n   E l e m e n t T y p e = " C o l u m n "   E l e m e n t I d = " 2 0 3 8 7 4 2 7 0 0 "   D a t a T y p e = " T e x t " > P a y m e n t T e r m s D e s c r i p t i o n < / P a y m e n t T e r m s D e s c r i p t i o n > 
+         < P a y m e n t T e r m s D e s c r i p t i o n _ L b l   E l e m e n t T y p e = " C o l u m n "   E l e m e n t I d = " 1 8 7 4 4 9 4 3 2 1 "   D a t a T y p e = " L a b e l " > P a y m e n t T e r m s D e s c r i p t i o n _ L b l < / P a y m e n t T e r m s D e s c r i p t i o n _ L b l > 
+         < P r i c e s I n c l u d i n g V A T   E l e m e n t T y p e = " C o l u m n "   E l e m e n t I d = " 5 1 8 8 1 7 1 6 7 "   D a t a T y p e = " B o o l e a n " > P r i c e s I n c l u d i n g V A T < / P r i c e s I n c l u d i n g V A T > 
+         < P r i c e s I n c l u d i n g V A T Y e s N o   E l e m e n t T y p e = " C o l u m n "   E l e m e n t I d = " 1 4 1 1 1 4 7 5 9 9 "   D a t a T y p e = " S t r i n g " > P r i c e s I n c l u d i n g V A T Y e s N o < / P r i c e s I n c l u d i n g V A T Y e s N o > 
+         < P r i c e s I n c l u d i n g V A T _ L b l   E l e m e n t T y p e = " C o l u m n "   E l e m e n t I d = " 1 3 7 7 9 7 9 4 4 4 "   D a t a T y p e = " S t r i n g " > P r i c e s I n c l u d i n g V A T _ L b l < / P r i c e s I n c l u d i n g V A T _ L b l > 
+         < Q u e s t i o n s _ L b l   E l e m e n t T y p e = " C o l u m n "   E l e m e n t I d = " 2 0 7 0 8 9 0 0 1 9 "   D a t a T y p e = " L a b e l " > Q u e s t i o n s _ L b l < / Q u e s t i o n s _ L b l > 
+         < S a l e s I n v o i c e L i n e D i s c o u n t _ L b l   E l e m e n t T y p e = " C o l u m n "   E l e m e n t I d = " 6 6 4 6 0 1 5 8 2 "   D a t a T y p e = " L a b e l " > S a l e s I n v o i c e L i n e D i s c o u n t _ L b l < / S a l e s I n v o i c e L i n e D i s c o u n t _ L b l > 
+         < S a l e s P e r s o n B l a n k _ L b l   E l e m e n t T y p e = " C o l u m n "   E l e m e n t I d = " 6 5 4 6 2 4 6 0 1 "   D a t a T y p e = " T e x t " > S a l e s P e r s o n B l a n k _ L b l < / S a l e s P e r s o n B l a n k _ L b l > 
+         < S a l e s P e r s o n N a m e   E l e m e n t T y p e = " C o l u m n "   E l e m e n t I d = " 8 7 1 4 9 2 9 8 3 "   D a t a T y p e = " T e x t " > S a l e s P e r s o n N a m e < / S a l e s P e r s o n N a m e > 
+         < S a l e s P e r s o n _ L b l   E l e m e n t T y p e = " C o l u m n "   E l e m e n t I d = " 1 5 6 4 1 9 6 3 6 5 "   D a t a T y p e = " L a b e l " > S a l e s P e r s o n _ L b l < / S a l e s P e r s o n _ L b l > 
+         < S a l e s p e r s o n _ L b l 2   E l e m e n t T y p e = " C o l u m n "   E l e m e n t I d = " 4 5 3 6 6 9 9 4 3 "   D a t a T y p e = " L a b e l " > S a l e s p e r s o n _ L b l 2 < / S a l e s p e r s o n _ L b l 2 > 
+         < S e l l T o C o n t a c t E m a i l   E l e m e n t T y p e = " C o l u m n "   E l e m e n t I d = " 2 6 2 8 2 4 5 6 4 "   D a t a T y p e = " T e x t " > S e l l T o C o n t a c t E m a i l < / S e l l T o C o n t a c t E m a i l > 
+         < S e l l T o C o n t a c t E m a i l L b l   E l e m e n t T y p e = " C o l u m n "   E l e m e n t I d = " 3 7 0 9 2 0 3 7 4 "   D a t a T y p e = " L a b e l " > S e l l T o C o n t a c t E m a i l L b l < / S e l l T o C o n t a c t E m a i l L b l > 
+         < S e l l T o C o n t a c t M o b i l e P h o n e N o   E l e m e n t T y p e = " C o l u m n "   E l e m e n t I d = " 1 8 4 3 5 8 7 4 7 "   D a t a T y p e = " T e x t " > S e l l T o C o n t a c t M o b i l e P h o n e N o < / S e l l T o C o n t a c t M o b i l e P h o n e N o > 
+         < S e l l T o C o n t a c t M o b i l e P h o n e N o L b l   E l e m e n t T y p e = " C o l u m n "   E l e m e n t I d = " 1 4 5 7 5 2 8 4 1 7 "   D a t a T y p e = " L a b e l " > S e l l T o C o n t a c t M o b i l e P h o n e N o L b l < / S e l l T o C o n t a c t M o b i l e P h o n e N o L b l > 
+         < S e l l T o C o n t a c t P h o n e N o   E l e m e n t T y p e = " C o l u m n "   E l e m e n t I d = " 1 6 1 3 8 2 2 4 8 3 "   D a t a T y p e = " T e x t " > S e l l T o C o n t a c t P h o n e N o < / S e l l T o C o n t a c t P h o n e N o > 
+         < S e l l T o C o n t a c t P h o n e N o L b l   E l e m e n t T y p e = " C o l u m n "   E l e m e n t I d = " 1 0 5 0 6 8 6 8 0 9 "   D a t a T y p e = " L a b e l " > S e l l T o C o n t a c t P h o n e N o L b l < / S e l l T o C o n t a c t P h o n e N o L b l > 
+         < S e l l t o C u s t o m e r N o   E l e m e n t T y p e = " C o l u m n "   E l e m e n t I d = " 2 0 5 0 6 4 7 3 4 9 "   D a t a T y p e = " C o d e " > S e l l t o C u s t o m e r N o < / S e l l t o C u s t o m e r N o > 
+         < S e l l t o C u s t o m e r N o _ L b l   E l e m e n t T y p e = " C o l u m n "   E l e m e n t I d = " 2 9 8 3 8 1 5 1 2 "   D a t a T y p e = " S t r i n g " > S e l l t o C u s t o m e r N o _ L b l < / S e l l t o C u s t o m e r N o _ L b l > 
+         < S h i p m e n t M e t h o d D e s c r i p t i o n   E l e m e n t T y p e = " C o l u m n "   E l e m e n t I d = " 2 0 5 9 4 0 3 2 6 0 "   D a t a T y p e = " T e x t " > S h i p m e n t M e t h o d D e s c r i p t i o n < / S h i p m e n t M e t h o d D e s c r i p t i o n > 
+         < S h i p m e n t M e t h o d D e s c r i p t i o n _ L b l   E l e m e n t T y p e = " C o l u m n "   E l e m e n t I d = " 1 1 7 9 9 7 8 4 6 5 "   D a t a T y p e = " L a b e l " > S h i p m e n t M e t h o d D e s c r i p t i o n _ L b l < / S h i p m e n t M e t h o d D e s c r i p t i o n _ L b l > 
+         < S h i p m e n t _ L b l   E l e m e n t T y p e = " C o l u m n "   E l e m e n t I d = " 2 0 8 5 7 6 7 1 2 0 "   D a t a T y p e = " L a b e l " > S h i p m e n t _ L b l < / S h i p m e n t _ L b l > 
+         < S h i p T o A d d r e s s 1   E l e m e n t T y p e = " C o l u m n "   E l e m e n t I d = " 1 3 5 7 6 7 2 8 6 1 "   D a t a T y p e = " T e x t " > S h i p T o A d d r e s s 1 < / S h i p T o A d d r e s s 1 > 
+         < S h i p T o A d d r e s s 2   E l e m e n t T y p e = " C o l u m n "   E l e m e n t I d = " 1 0 2 4 2 0 4 5 8 4 "   D a t a T y p e = " T e x t " > S h i p T o A d d r e s s 2 < / S h i p T o A d d r e s s 2 > 
+         < S h i p T o A d d r e s s 3   E l e m e n t T y p e = " C o l u m n "   E l e m e n t I d = " 1 6 6 1 9 0 1 2 0 1 "   D a t a T y p e = " T e x t " > S h i p T o A d d r e s s 3 < / S h i p T o A d d r e s s 3 > 
+         < S h i p T o A d d r e s s 4   E l e m e n t T y p e = " C o l u m n "   E l e m e n t I d = " 5 5 5 4 1 6 9 9 0 "   D a t a T y p e = " T e x t " > S h i p T o A d d r e s s 4 < / S h i p T o A d d r e s s 4 > 
+         < S h i p T o A d d r e s s 5   E l e m e n t T y p e = " C o l u m n "   E l e m e n t I d = " 1 1 9 3 1 1 3 6 0 7 "   D a t a T y p e = " T e x t " > S h i p T o A d d r e s s 5 < / S h i p T o A d d r e s s 5 > 
+         < S h i p T o A d d r e s s 6   E l e m e n t T y p e = " C o l u m n "   E l e m e n t I d = " 7 1 9 9 7 6 2 4 4 "   D a t a T y p e = " T e x t " > S h i p T o A d d r e s s 6 < / S h i p T o A d d r e s s 6 > 
+         < S h i p T o A d d r e s s 7   E l e m e n t T y p e = " C o l u m n "   E l e m e n t I d = " 8 2 2 7 9 6 2 7 "   D a t a T y p e = " T e x t " > S h i p T o A d d r e s s 7 < / S h i p T o A d d r e s s 7 > 
+         < S h i p T o A d d r e s s 8   E l e m e n t T y p e = " C o l u m n "   E l e m e n t I d = " 1 4 9 2 9 9 2 1 7 8 "   D a t a T y p e = " T e x t " > S h i p T o A d d r e s s 8 < / S h i p T o A d d r e s s 8 > 
+         < S h i p T o A d d r e s s _ L b l   E l e m e n t T y p e = " C o l u m n "   E l e m e n t I d = " 1 6 5 0 5 0 5 0 1 7 "   D a t a T y p e = " L a b e l " > S h i p T o A d d r e s s _ L b l < / S h i p T o A d d r e s s _ L b l > 
+         < S h i p T o P h o n e N o   E l e m e n t T y p e = " C o l u m n "   E l e m e n t I d = " 3 6 9 7 0 2 2 5 5 "   D a t a T y p e = " T e x t " > S h i p T o P h o n e N o < / S h i p T o P h o n e N o > 
+         < S h o w S h i p p i n g A d d r e s s   E l e m e n t T y p e = " C o l u m n "   E l e m e n t I d = " 1 1 2 0 0 7 1 2 6 6 "   D a t a T y p e = " B o o l e a n " > S h o w S h i p p i n g A d d r e s s < / S h o w S h i p p i n g A d d r e s s > 
+         < S h o w W o r k D e s c r i p t i o n   E l e m e n t T y p e = " C o l u m n "   E l e m e n t I d = " 7 8 5 4 6 8 8 6 5 "   D a t a T y p e = " B o o l e a n " > S h o w W o r k D e s c r i p t i o n < / S h o w W o r k D e s c r i p t i o n > 
+         < S u b t o t a l _ L b l   E l e m e n t T y p e = " C o l u m n "   E l e m e n t I d = " 1 9 6 7 7 9 5 1 4 2 "   D a t a T y p e = " L a b e l " > S u b t o t a l _ L b l < / S u b t o t a l _ L b l > 
+         < T h a n k s _ L b l   E l e m e n t T y p e = " C o l u m n "   E l e m e n t I d = " 2 1 0 3 3 0 5 5 2 5 "   D a t a T y p e = " L a b e l " > T h a n k s _ L b l < / T h a n k s _ L b l > 
+         < T o t a l _ L b l   E l e m e n t T y p e = " C o l u m n "   E l e m e n t I d = " 1 2 1 0 1 0 0 8 7 8 "   D a t a T y p e = " L a b e l " > T o t a l _ L b l < / T o t a l _ L b l > 
+         < V A T A m o u n t S p e c i f i c a t i o n _ L b l   E l e m e n t T y p e = " C o l u m n "   E l e m e n t I d = " 8 7 8 7 0 6 8 4 6 "   D a t a T y p e = " L a b e l " > V A T A m o u n t S p e c i f i c a t i o n _ L b l < / V A T A m o u n t S p e c i f i c a t i o n _ L b l > 
+         < V A T A m o u n t _ L b l   E l e m e n t T y p e = " C o l u m n "   E l e m e n t I d = " 1 0 9 4 6 5 7 2 9 "   D a t a T y p e = " L a b e l " > V A T A m o u n t _ L b l < / V A T A m o u n t _ L b l > 
+         < V A T B a s e _ L b l   E l e m e n t T y p e = " C o l u m n "   E l e m e n t I d = " 1 8 6 6 1 5 8 2 7 8 "   D a t a T y p e = " L a b e l " > V A T B a s e _ L b l < / V A T B a s e _ L b l > 
+         < V A T C l a u s e s _ L b l   E l e m e n t T y p e = " C o l u m n "   E l e m e n t I d = " 1 3 8 3 9 2 0 0 1 9 "   D a t a T y p e = " L a b e l " > V A T C l a u s e s _ L b l < / V A T C l a u s e s _ L b l > 
+         < V A T C l a u s e _ L b l   E l e m e n t T y p e = " C o l u m n "   E l e m e n t I d = " 1 5 7 0 4 9 5 4 9 0 "   D a t a T y p e = " S t r i n g " > V A T C l a u s e _ L b l < / V A T C l a u s e _ L b l > 
+         < V A T I d e n t i f i e r _ L b l   E l e m e n t T y p e = " C o l u m n "   E l e m e n t I d = " 1 6 8 6 6 2 3 9 8 4 "   D a t a T y p e = " L a b e l " > V A T I d e n t i f i e r _ L b l < / V A T I d e n t i f i e r _ L b l > 
+         < V A T P e r c e n t a g e _ L b l   E l e m e n t T y p e = " C o l u m n "   E l e m e n t I d = " 6 7 6 6 5 4 5 6 5 "   D a t a T y p e = " L a b e l " > V A T P e r c e n t a g e _ L b l < / V A T P e r c e n t a g e _ L b l > 
+         < V A T R e g i s t r a t i o n N o   E l e m e n t T y p e = " C o l u m n "   E l e m e n t I d = " 1 8 8 9 1 9 5 4 0 2 "   D a t a T y p e = " T e x t " > V A T R e g i s t r a t i o n N o < / V A T R e g i s t r a t i o n N o > 
+         < V A T R e g i s t r a t i o n N o _ L b l   E l e m e n t T y p e = " C o l u m n "   E l e m e n t I d = " 1 4 2 4 6 1 6 0 8 5 "   D a t a T y p e = " T e x t " > V A T R e g i s t r a t i o n N o _ L b l < / V A T R e g i s t r a t i o n N o _ L b l > 
+         < Y o u r D o c u m e n t T i t l e _ L b l   E l e m e n t T y p e = " C o l u m n "   E l e m e n t I d = " 1 8 2 1 7 1 6 9 3 4 "   D a t a T y p e = " T e x t " > Y o u r D o c u m e n t T i t l e _ L b l < / Y o u r D o c u m e n t T i t l e _ L b l > 
+         < Y o u r R e f e r e n c e   E l e m e n t T y p e = " C o l u m n "   E l e m e n t I d = " 1 1 0 3 9 9 5 1 "   D a t a T y p e = " T e x t " > Y o u r R e f e r e n c e < / Y o u r R e f e r e n c e > 
+         < Y o u r R e f e r e n c e _ L b l   E l e m e n t T y p e = " C o l u m n "   E l e m e n t I d = " 4 6 5 4 7 7 4 2 6 "   D a t a T y p e = " S t r i n g " > Y o u r R e f e r e n c e _ L b l < / Y o u r R e f e r e n c e _ L b l > 
+         < L i n e   E l e m e n t T y p e = " D a t a I t e m "   E l e m e n t I d = " 4 1 1 9 7 6 1 3 3 " > 
+             < A m o u n t E x c l u d i n g V A T _ L i n e   E l e m e n t T y p e = " C o l u m n "   E l e m e n t I d = " 1 0 6 2 4 6 0 0 4 0 "   D a t a T y p e = " D e c i m a l " > A m o u n t E x c l u d i n g V A T _ L i n e < / A m o u n t E x c l u d i n g V A T _ L i n e > 
+             < A m o u n t E x c l u d i n g V A T _ L i n e _ L b l   E l e m e n t T y p e = " C o l u m n "   E l e m e n t I d = " 2 0 0 2 8 7 4 4 7 5 "   D a t a T y p e = " S t r i n g " > A m o u n t E x c l u d i n g V A T _ L i n e _ L b l < / A m o u n t E x c l u d i n g V A T _ L i n e _ L b l > 
+             < A m o u n t I n c l u d i n g V A T _ L i n e   E l e m e n t T y p e = " C o l u m n "   E l e m e n t I d = " 7 7 0 9 2 8 4 0 2 "   D a t a T y p e = " D e c i m a l " > A m o u n t I n c l u d i n g V A T _ L i n e < / A m o u n t I n c l u d i n g V A T _ L i n e > 
+             < A m o u n t I n c l u d i n g V A T _ L i n e _ L b l   E l e m e n t T y p e = " C o l u m n "   E l e m e n t I d = " 9 3 0 7 4 7 3 1 3 "   D a t a T y p e = " S t r i n g " > A m o u n t I n c l u d i n g V A T _ L i n e _ L b l < / A m o u n t I n c l u d i n g V A T _ L i n e _ L b l > 
+             < D e s c r i p t i o n _ L i n e   E l e m e n t T y p e = " C o l u m n "   E l e m e n t I d = " 1 4 0 6 8 2 2 3 1 0 "   D a t a T y p e = " T e x t " > D e s c r i p t i o n _ L i n e < / D e s c r i p t i o n _ L i n e > 
+             < D e s c r i p t i o n _ L i n e _ L b l   E l e m e n t T y p e = " C o l u m n "   E l e m e n t I d = " 2 1 1 8 9 5 1 4 9 5 "   D a t a T y p e = " S t r i n g " > D e s c r i p t i o n _ L i n e _ L b l < / D e s c r i p t i o n _ L i n e _ L b l > 
+             < I t e m N o _ L i n e   E l e m e n t T y p e = " C o l u m n "   E l e m e n t I d = " 1 9 1 0 2 9 6 2 8 8 "   D a t a T y p e = " C o d e " > I t e m N o _ L i n e < / I t e m N o _ L i n e > 
+             < I t e m N o _ L i n e _ L b l   E l e m e n t T y p e = " C o l u m n "   E l e m e n t I d = " 1 3 4 0 0 7 9 6 1 3 "   D a t a T y p e = " S t r i n g " > I t e m N o _ L i n e _ L b l < / I t e m N o _ L i n e _ L b l > 
+             < I t e m R e f e r e n c e N o _ L i n e   E l e m e n t T y p e = " C o l u m n "   E l e m e n t I d = " 9 2 7 2 3 5 7 "   D a t a T y p e = " C o d e " > I t e m R e f e r e n c e N o _ L i n e < / I t e m R e f e r e n c e N o _ L i n e > 
+             < I t e m R e f e r e n c e N o _ L i n e _ L b l   E l e m e n t T y p e = " C o l u m n "   E l e m e n t I d = " 1 9 8 0 6 3 1 1 3 0 "   D a t a T y p e = " S t r i n g " > I t e m R e f e r e n c e N o _ L i n e _ L b l < / I t e m R e f e r e n c e N o _ L i n e _ L b l > 
+             < L i n e A m o u n t _ L b l   E l e m e n t T y p e = " C o l u m n "   E l e m e n t I d = " 5 3 0 8 1 9 8 6 6 "   D a t a T y p e = " L a b e l " > L i n e A m o u n t _ L b l < / L i n e A m o u n t _ L b l > 
+             < L i n e A m o u n t _ L i n e   E l e m e n t T y p e = " C o l u m n "   E l e m e n t I d = " 2 6 8 9 3 7 1 6 2 "   D a t a T y p e = " T e x t " > L i n e A m o u n t _ L i n e < / L i n e A m o u n t _ L i n e > 
+             < L i n e A m o u n t _ L i n e _ L b l   E l e m e n t T y p e = " C o l u m n "   E l e m e n t I d = " 9 9 2 9 0 1 8 4 5 "   D a t a T y p e = " S t r i n g " > L i n e A m o u n t _ L i n e _ L b l < / L i n e A m o u n t _ L i n e _ L b l > 
+             < L i n e D i s c o u n t P e r c e n t T e x t _ L i n e   E l e m e n t T y p e = " C o l u m n "   E l e m e n t I d = " 6 1 3 1 3 5 1 9 "   D a t a T y p e = " T e x t " > L i n e D i s c o u n t P e r c e n t T e x t _ L i n e < / L i n e D i s c o u n t P e r c e n t T e x t _ L i n e > 
+             < L i n e D i s c o u n t P e r c e n t _ L i n e   E l e m e n t T y p e = " C o l u m n "   E l e m e n t I d = " 9 0 7 8 2 7 4 3 6 "   D a t a T y p e = " D e c i m a l " > L i n e D i s c o u n t P e r c e n t _ L i n e < / L i n e D i s c o u n t P e r c e n t _ L i n e > 
+             < L i n e N o _ L i n e   E l e m e n t T y p e = " C o l u m n "   E l e m e n t I d = " 6 9 8 9 8 5 9 7 9 "   D a t a T y p e = " I n t e g e r " > L i n e N o _ L i n e < / L i n e N o _ L i n e > 
+             < P r i c e P e r _ L b l   E l e m e n t T y p e = " C o l u m n "   E l e m e n t I d = " 9 7 3 2 8 0 1 3 4 "   D a t a T y p e = " L a b e l " > P r i c e P e r _ L b l < / P r i c e P e r _ L b l > 
+             < P r i c e _ L b l   E l e m e n t T y p e = " C o l u m n "   E l e m e n t I d = " 2 1 2 6 7 6 4 9 2 5 "   D a t a T y p e = " L a b e l " > P r i c e _ L b l < / P r i c e _ L b l > 
+             < Q t y _ L b l   E l e m e n t T y p e = " C o l u m n "   E l e m e n t I d = " 2 6 3 6 7 3 7 6 4 "   D a t a T y p e = " L a b e l " > Q t y _ L b l < / Q t y _ L b l > 
+             < Q u a n t i t y _ L i n e   E l e m e n t T y p e = " C o l u m n "   E l e m e n t I d = " 1 0 6 8 5 4 3 5 3 7 "   D a t a T y p e = " T e x t " > Q u a n t i t y _ L i n e < / Q u a n t i t y _ L i n e > 
+             < Q u a n t i t y _ L i n e _ L b l   E l e m e n t T y p e = " C o l u m n "   E l e m e n t I d = " 2 0 3 4 5 0 6 8 0 2 "   D a t a T y p e = " S t r i n g " > Q u a n t i t y _ L i n e _ L b l < / Q u a n t i t y _ L i n e _ L b l > 
+             < S h i p m e n t D a t e _ L i n e   E l e m e n t T y p e = " C o l u m n "   E l e m e n t I d = " 1 6 7 3 3 7 5 4 1 6 "   D a t a T y p e = " S t r i n g " > S h i p m e n t D a t e _ L i n e < / S h i p m e n t D a t e _ L i n e > 
+             < S h i p m e n t D a t e _ L i n e _ L b l   E l e m e n t T y p e = " C o l u m n "   E l e m e n t I d = " 8 5 3 2 2 4 3 6 3 "   D a t a T y p e = " L a b e l " > S h i p m e n t D a t e _ L i n e _ L b l < / S h i p m e n t D a t e _ L i n e _ L b l > 
+             < T r a n s H e a d e r A m o u n t   E l e m e n t T y p e = " C o l u m n "   E l e m e n t I d = " 2 0 2 8 3 0 6 2 7 6 "   D a t a T y p e = " D e c i m a l " > T r a n s H e a d e r A m o u n t < / T r a n s H e a d e r A m o u n t > 
+             < T y p e _ L i n e   E l e m e n t T y p e = " C o l u m n "   E l e m e n t I d = " 2 7 2 8 0 4 9 2 4 "   D a t a T y p e = " S t r i n g " > T y p e _ L i n e < / T y p e _ L i n e > 
+             < U n i t O f M e a s u r e   E l e m e n t T y p e = " C o l u m n "   E l e m e n t I d = " 1 8 0 8 2 2 8 0 1 8 "   D a t a T y p e = " T e x t " > U n i t O f M e a s u r e < / U n i t O f M e a s u r e > 
+             < U n i t O f M e a s u r e _ L b l   E l e m e n t T y p e = " C o l u m n "   E l e m e n t I d = " 9 8 1 9 5 1 2 4 9 "   D a t a T y p e = " S t r i n g " > U n i t O f M e a s u r e _ L b l < / U n i t O f M e a s u r e _ L b l > 
+             < U n i t P r i c e   E l e m e n t T y p e = " C o l u m n "   E l e m e n t I d = " 1 4 7 8 2 2 1 5 2 6 "   D a t a T y p e = " T e x t " > U n i t P r i c e < / U n i t P r i c e > 
+             < U n i t P r i c e _ L b l   E l e m e n t T y p e = " C o l u m n "   E l e m e n t I d = " 1 1 6 3 9 2 6 6 0 3 "   D a t a T y p e = " S t r i n g " > U n i t P r i c e _ L b l < / U n i t P r i c e _ L b l > 
+             < U n i t P r i c e _ L b l 2   E l e m e n t T y p e = " C o l u m n "   E l e m e n t I d = " 1 8 9 4 7 3 3 7 2 9 "   D a t a T y p e = " L a b e l " > U n i t P r i c e _ L b l 2 < / U n i t P r i c e _ L b l 2 > 
+             < U n i t _ L b l   E l e m e n t T y p e = " C o l u m n "   E l e m e n t I d = " 8 1 4 3 6 4 3 1 8 "   D a t a T y p e = " L a b e l " > U n i t _ L b l < / U n i t _ L b l > 
+             < V A T I d e n t i f i e r _ L i n e   E l e m e n t T y p e = " C o l u m n "   E l e m e n t I d = " 1 7 7 3 6 2 2 4 1 2 "   D a t a T y p e = " C o d e " > V A T I d e n t i f i e r _ L i n e < / V A T I d e n t i f i e r _ L i n e > 
+             < V A T I d e n t i f i e r _ L i n e _ L b l   E l e m e n t T y p e = " C o l u m n "   E l e m e n t I d = " 5 3 3 7 8 2 7 0 3 "   D a t a T y p e = " S t r i n g " > V A T I d e n t i f i e r _ L i n e _ L b l < / V A T I d e n t i f i e r _ L i n e _ L b l > 
+             < V A T P c t _ L i n e   E l e m e n t T y p e = " C o l u m n "   E l e m e n t I d = " 1 9 7 4 0 0 1 9 4 4 "   D a t a T y p e = " T e x t " > V A T P c t _ L i n e < / V A T P c t _ L i n e > 
+             < V A T P c t _ L i n e _ L b l   E l e m e n t T y p e = " C o l u m n "   E l e m e n t I d = " 1 2 0 7 5 2 9 9 1 5 "   D a t a T y p e = " S t r i n g " > V A T P c t _ L i n e _ L b l < / V A T P c t _ L i n e _ L b l > 
+         < / L i n e > 
+         < W o r k D e s c r i p t i o n L i n e s   E l e m e n t T y p e = " D a t a I t e m "   E l e m e n t I d = " 2 7 6 8 1 9 4 4 7 " > 
+             < W o r k D e s c r i p t i o n L i n e   E l e m e n t T y p e = " C o l u m n "   E l e m e n t I d = " 1 9 4 7 6 2 1 6 7 6 "   D a t a T y p e = " T e x t " > W o r k D e s c r i p t i o n L i n e < / W o r k D e s c r i p t i o n L i n e > 
+             < W o r k D e s c r i p t i o n L i n e N u m b e r   E l e m e n t T y p e = " C o l u m n "   E l e m e n t I d = " 7 9 7 3 0 7 2 2 3 "   D a t a T y p e = " I n t e g e r " > W o r k D e s c r i p t i o n L i n e N u m b e r < / W o r k D e s c r i p t i o n L i n e N u m b e r > 
+         < / W o r k D e s c r i p t i o n L i n e s > 
+         < V A T A m o u n t L i n e   E l e m e n t T y p e = " D a t a I t e m "   E l e m e n t I d = " 8 2 7 5 3 4 3 4 8 " > 
+             < I n v o i c e D i s c o u n t A m o u n t _ V A T A m o u n t L i n e   E l e m e n t T y p e = " C o l u m n "   E l e m e n t I d = " 8 2 4 7 3 0 1 4 1 "   D a t a T y p e = " D e c i m a l " > I n v o i c e D i s c o u n t A m o u n t _ V A T A m o u n t L i n e < / I n v o i c e D i s c o u n t A m o u n t _ V A T A m o u n t L i n e > 
+             < I n v o i c e D i s c o u n t A m o u n t _ V A T A m o u n t L i n e _ L b l   E l e m e n t T y p e = " C o l u m n "   E l e m e n t I d = " 1 5 6 2 2 0 0 0 3 4 "   D a t a T y p e = " S t r i n g " > I n v o i c e D i s c o u n t A m o u n t _ V A T A m o u n t L i n e _ L b l < / I n v o i c e D i s c o u n t A m o u n t _ V A T A m o u n t L i n e _ L b l > 
+             < I n v o i c e D i s c o u n t B a s e A m o u n t _ V A T A m o u n t L i n e   E l e m e n t T y p e = " C o l u m n "   E l e m e n t I d = " 2 0 4 0 3 3 2 2 6 6 "   D a t a T y p e = " D e c i m a l " > I n v o i c e D i s c o u n t B a s e A m o u n t _ V A T A m o u n t L i n e < / I n v o i c e D i s c o u n t B a s e A m o u n t _ V A T A m o u n t L i n e > 
+             < I n v o i c e D i s c o u n t B a s e A m o u n t _ V A T A m o u n t L i n e _ L b l   E l e m e n t T y p e = " C o l u m n "   E l e m e n t I d = " 4 0 5 9 6 0 3 3 1 "   D a t a T y p e = " S t r i n g " > I n v o i c e D i s c o u n t B a s e A m o u n t _ V A T A m o u n t L i n e _ L b l < / I n v o i c e D i s c o u n t B a s e A m o u n t _ V A T A m o u n t L i n e _ L b l > 
+             < L i n e A m o u n t _ V a t A m o u n t L i n e   E l e m e n t T y p e = " C o l u m n "   E l e m e n t I d = " 2 1 4 6 5 4 0 1 "   D a t a T y p e = " D e c i m a l " > L i n e A m o u n t _ V a t A m o u n t L i n e < / L i n e A m o u n t _ V a t A m o u n t L i n e > 
+             < L i n e A m o u n t _ V a t A m o u n t L i n e _ L b l   E l e m e n t T y p e = " C o l u m n "   E l e m e n t I d = " 1 1 1 0 9 1 2 1 2 4 "   D a t a T y p e = " S t r i n g " > L i n e A m o u n t _ V a t A m o u n t L i n e _ L b l < / L i n e A m o u n t _ V a t A m o u n t L i n e _ L b l > 
+             < N o O f V A T I d e n t i f i e r s   E l e m e n t T y p e = " C o l u m n "   E l e m e n t I d = " 1 1 5 3 2 6 3 0 2 6 "   D a t a T y p e = " I n t e g e r " > N o O f V A T I d e n t i f i e r s < / N o O f V A T I d e n t i f i e r s > 
+             < V A T A m o u n t L C Y _ V A T A m o u n t L i n e   E l e m e n t T y p e = " C o l u m n "   E l e m e n t I d = " 1 5 8 1 9 9 4 3 5 0 "   D a t a T y p e = " D e c i m a l " > V A T A m o u n t L C Y _ V A T A m o u n t L i n e < / V A T A m o u n t L C Y _ V A T A m o u n t L i n e > 
+             < V A T A m o u n t L C Y _ V A T A m o u n t L i n e _ L b l   E l e m e n t T y p e = " C o l u m n "   E l e m e n t I d = " 9 2 3 0 0 3 3 7 "   D a t a T y p e = " L a b e l " > V A T A m o u n t L C Y _ V A T A m o u n t L i n e _ L b l < / V A T A m o u n t L C Y _ V A T A m o u n t L i n e _ L b l > 
+             < V A T A m o u n t _ V a t A m o u n t L i n e   E l e m e n t T y p e = " C o l u m n "   E l e m e n t I d = " 1 8 9 1 8 2 0 6 2 0 "   D a t a T y p e = " D e c i m a l " > V A T A m o u n t _ V a t A m o u n t L i n e < / V A T A m o u n t _ V a t A m o u n t L i n e > 
+             < V A T A m o u n t _ V a t A m o u n t L i n e _ L b l   E l e m e n t T y p e = " C o l u m n "   E l e m e n t I d = " 1 5 1 3 5 5 5 4 7 3 "   D a t a T y p e = " S t r i n g " > V A T A m o u n t _ V a t A m o u n t L i n e _ L b l < / V A T A m o u n t _ V a t A m o u n t L i n e _ L b l > 
+             < V A T B a s e L C Y _ V A T A m o u n t L i n e   E l e m e n t T y p e = " C o l u m n "   E l e m e n t I d = " 1 8 6 0 9 4 5 6 3 5 "   D a t a T y p e = " D e c i m a l " > V A T B a s e L C Y _ V A T A m o u n t L i n e < / V A T B a s e L C Y _ V A T A m o u n t L i n e > 
+             < V A T B a s e L C Y _ V A T A m o u n t L i n e _ L b l   E l e m e n t T y p e = " C o l u m n "   E l e m e n t I d = " 1 2 3 6 4 6 7 9 9 8 "   D a t a T y p e = " L a b e l " > V A T B a s e L C Y _ V A T A m o u n t L i n e _ L b l < / V A T B a s e L C Y _ V A T A m o u n t L i n e _ L b l > 
+             < V A T B a s e _ V a t A m o u n t L i n e   E l e m e n t T y p e = " C o l u m n "   E l e m e n t I d = " 1 4 5 8 9 3 7 8 1 9 "   D a t a T y p e = " D e c i m a l " > V A T B a s e _ V a t A m o u n t L i n e < / V A T B a s e _ V a t A m o u n t L i n e > 
+             < V A T B a s e _ V a t A m o u n t L i n e _ L b l   E l e m e n t T y p e = " C o l u m n "   E l e m e n t I d = " 1 6 9 1 3 0 2 4 8 8 "   D a t a T y p e = " S t r i n g " > V A T B a s e _ V a t A m o u n t L i n e _ L b l < / V A T B a s e _ V a t A m o u n t L i n e _ L b l > 
+             < V A T I d e n t i f i e r _ V a t A m o u n t L i n e   E l e m e n t T y p e = " C o l u m n "   E l e m e n t I d = " 1 1 4 2 0 7 0 0 3 5 "   D a t a T y p e = " C o d e " > V A T I d e n t i f i e r _ V a t A m o u n t L i n e < / V A T I d e n t i f i e r _ V a t A m o u n t L i n e > 
+             < V A T I d e n t i f i e r _ V a t A m o u n t L i n e _ L b l   E l e m e n t T y p e = " C o l u m n "   E l e m e n t I d = " 8 6 4 5 0 4 5 0 "   D a t a T y p e = " S t r i n g " > V A T I d e n t i f i e r _ V a t A m o u n t L i n e _ L b l < / V A T I d e n t i f i e r _ V a t A m o u n t L i n e _ L b l > 
+             < V A T P c t _ V a t A m o u n t L i n e   E l e m e n t T y p e = " C o l u m n "   E l e m e n t I d = " 1 4 5 3 5 4 2 7 7 7 "   D a t a T y p e = " D e c i m a l " > V A T P c t _ V a t A m o u n t L i n e < / V A T P c t _ V a t A m o u n t L i n e > 
+             < V A T P c t _ V a t A m o u n t L i n e _ L b l   E l e m e n t T y p e = " C o l u m n "   E l e m e n t I d = " 6 7 6 3 2 3 7 8 "   D a t a T y p e = " S t r i n g " > V A T P c t _ V a t A m o u n t L i n e _ L b l < / V A T P c t _ V a t A m o u n t L i n e _ L b l > 
+         < / V A T A m o u n t L i n e > 
+         < R e p o r t T o t a l s L i n e   E l e m e n t T y p e = " D a t a I t e m "   E l e m e n t I d = " 2 1 2 2 5 4 9 8 3 6 " > 
+             < A m o u n t F o r m a t t e d _ R e p o r t T o t a l s L i n e   E l e m e n t T y p e = " C o l u m n "   E l e m e n t I d = " 1 5 0 6 1 3 6 8 2 5 "   D a t a T y p e = " T e x t " > A m o u n t F o r m a t t e d _ R e p o r t T o t a l s L i n e < / A m o u n t F o r m a t t e d _ R e p o r t T o t a l s L i n e > 
+             < A m o u n t _ R e p o r t T o t a l s L i n e   E l e m e n t T y p e = " C o l u m n "   E l e m e n t I d = " 4 1 9 9 1 8 3 6 9 "   D a t a T y p e = " D e c i m a l " > A m o u n t _ R e p o r t T o t a l s L i n e < / A m o u n t _ R e p o r t T o t a l s L i n e > 
+             < D e s c r i p t i o n _ R e p o r t T o t a l s L i n e   E l e m e n t T y p e = " C o l u m n "   E l e m e n t I d = " 5 8 1 9 9 6 0 6 7 "   D a t a T y p e = " T e x t " > D e s c r i p t i o n _ R e p o r t T o t a l s L i n e < / D e s c r i p t i o n _ R e p o r t T o t a l s L i n e > 
+             < F o n t B o l d _ R e p o r t T o t a l s L i n e   E l e m e n t T y p e = " C o l u m n "   E l e m e n t I d = " 9 4 6 5 4 0 5 4 9 "   D a t a T y p e = " B o o l e a n " > F o n t B o l d _ R e p o r t T o t a l s L i n e < / F o n t B o l d _ R e p o r t T o t a l s L i n e > 
+             < F o n t U n d e r l i n e _ R e p o r t T o t a l s L i n e   E l e m e n t T y p e = " C o l u m n "   E l e m e n t I d = " 2 0 2 1 5 3 3 6 9 4 "   D a t a T y p e = " B o o l e a n " > F o n t U n d e r l i n e _ R e p o r t T o t a l s L i n e < / F o n t U n d e r l i n e _ R e p o r t T o t a l s L i n e > 
+         < / R e p o r t T o t a l s L i n e > 
+         < P a y m e n t R e p o r t i n g A r g u m e n t   E l e m e n t T y p e = " D a t a I t e m "   E l e m e n t I d = " 3 1 3 7 4 4 1 9 4 " > 
+             < P a y m e n t S e r v i c e L o g o   E l e m e n t T y p e = " C o l u m n "   E l e m e n t I d = " 4 1 6 7 9 0 7 6 7 "   D a t a T y p e = " B l o b "   / > 
+             < P a y m e n t S e r v i c e L o g o _ U r l   E l e m e n t T y p e = " C o l u m n "   E l e m e n t I d = " 6 4 4 9 7 5 1 3 9 "   D a t a T y p e = " T e x t " > P a y m e n t S e r v i c e L o g o _ U r l < / P a y m e n t S e r v i c e L o g o _ U r l > 
+             < P a y m e n t S e r v i c e L o g o _ U r l T e x t   E l e m e n t T y p e = " C o l u m n "   E l e m e n t I d = " 1 4 1 1 7 0 3 9 7 6 "   D a t a T y p e = " T e x t " > P a y m e n t S e r v i c e L o g o _ U r l T e x t < / P a y m e n t S e r v i c e L o g o _ U r l T e x t > 
+             < P a y m e n t S e r v i c e T e x t _ U r l   E l e m e n t T y p e = " C o l u m n "   E l e m e n t I d = " 1 7 4 2 3 3 4 7 "   D a t a T y p e = " T e x t " > P a y m e n t S e r v i c e T e x t _ U r l < / P a y m e n t S e r v i c e T e x t _ U r l > 
+             < P a y m e n t S e r v i c e T e x t _ U r l T e x t   E l e m e n t T y p e = " C o l u m n "   E l e m e n t I d = " 1 6 3 6 7 7 2 9 3 4 "   D a t a T y p e = " T e x t " > P a y m e n t S e r v i c e T e x t _ U r l T e x t < / P a y m e n t S e r v i c e T e x t _ U r l T e x t > 
+         < / P a y m e n t R e p o r t i n g A r g u m e n t > 
+         < L e t t e r T e x t   E l e m e n t T y p e = " D a t a I t e m "   E l e m e n t I d = " 1 5 1 0 3 5 3 8 3 4 " > 
+             < B o d y T e x t   E l e m e n t T y p e = " C o l u m n "   E l e m e n t I d = " 1 4 9 7 5 9 8 0 8 "   D a t a T y p e = " T e x t " > B o d y T e x t < / B o d y T e x t > 
+             < C l o s i n g T e x t   E l e m e n t T y p e = " C o l u m n "   E l e m e n t I d = " 5 1 2 1 3 5 9 0 9 "   D a t a T y p e = " L a b e l " > C l o s i n g T e x t < / C l o s i n g T e x t > 
+             < G r e e t i n g T e x t   E l e m e n t T y p e = " C o l u m n "   E l e m e n t I d = " 1 1 7 5 2 7 9 2 8 9 "   D a t a T y p e = " L a b e l " > G r e e t i n g T e x t < / G r e e t i n g T e x t > 
+             < P m t D i s c T e x t   E l e m e n t T y p e = " C o l u m n "   E l e m e n t I d = " 2 0 1 3 8 4 9 9 4 8 "   D a t a T y p e = " T e x t " > P m t D i s c T e x t < / P m t D i s c T e x t > 
+         < / L e t t e r T e x t > 
+         < U S R e p o r t T o t a l s L i n e   E l e m e n t T y p e = " D a t a I t e m "   E l e m e n t I d = " 7 4 2 3 3 6 7 0 6 " > 
+             < A m o u n t F o r m a t t e d _ U S R e p o r t T o t a l s L i n e   E l e m e n t T y p e = " C o l u m n "   E l e m e n t I d = " 1 0 3 8 5 5 0 3 5 9 "   D a t a T y p e = " T e x t " > A m o u n t F o r m a t t e d _ U S R e p o r t T o t a l s L i n e < / A m o u n t F o r m a t t e d _ U S R e p o r t T o t a l s L i n e > 
+             < A m o u n t _ U S R e p o r t T o t a l s L i n e   E l e m e n t T y p e = " C o l u m n "   E l e m e n t I d = " 1 6 1 5 8 6 5 3 9 1 "   D a t a T y p e = " D e c i m a l " > A m o u n t _ U S R e p o r t T o t a l s L i n e < / A m o u n t _ U S R e p o r t T o t a l s L i n e > 
+             < D e s c r i p t i o n _ U S R e p o r t T o t a l s L i n e   E l e m e n t T y p e = " C o l u m n "   E l e m e n t I d = " 9 4 2 4 1 1 5 0 7 "   D a t a T y p e = " T e x t " > D e s c r i p t i o n _ U S R e p o r t T o t a l s L i n e < / D e s c r i p t i o n _ U S R e p o r t T o t a l s L i n e > 
+             < F o n t B o l d _ U S R e p o r t T o t a l s L i n e   E l e m e n t T y p e = " C o l u m n "   E l e m e n t I d = " 1 3 9 6 8 7 3 6 3 7 "   D a t a T y p e = " B o o l e a n " > F o n t B o l d _ U S R e p o r t T o t a l s L i n e < / F o n t B o l d _ U S R e p o r t T o t a l s L i n e > 
+             < F o n t U n d e r l i n e _ U S R e p o r t T o t a l s L i n e   E l e m e n t T y p e = " C o l u m n "   E l e m e n t I d = " 1 1 5 9 9 8 8 0 0 "   D a t a T y p e = " B o o l e a n " > F o n t U n d e r l i n e _ U S R e p o r t T o t a l s L i n e < / F o n t U n d e r l i n e _ U S R e p o r t T o t a l s L i n e > 
+         < / U S R e p o r t T o t a l s L i n e > 
+         < T o t a l s   E l e m e n t T y p e = " D a t a I t e m "   E l e m e n t I d = " 1 8 2 3 9 5 0 0 4 4 " > 
+             < A m o u n t E x e m p t F r o m S a l e s T a x   E l e m e n t T y p e = " C o l u m n "   E l e m e n t I d = " 7 9 3 2 4 4 0 5 9 "   D a t a T y p e = " D e c i m a l " > A m o u n t E x e m p t F r o m S a l e s T a x < / A m o u n t E x e m p t F r o m S a l e s T a x > 
+             < A m o u n t E x e m p t F r o m S a l e s T a x L b l   E l e m e n t T y p e = " C o l u m n "   E l e m e n t I d = " 1 7 8 0 8 1 7 8 8 7 "   D a t a T y p e = " L a b e l " > A m o u n t E x e m p t F r o m S a l e s T a x L b l < / A m o u n t E x e m p t F r o m S a l e s T a x L b l > 
+             < A m o u n t S u b j e c t T o S a l e s T a x   E l e m e n t T y p e = " C o l u m n "   E l e m e n t I d = " 6 3 4 1 2 5 3 0 7 "   D a t a T y p e = " D e c i m a l " > A m o u n t S u b j e c t T o S a l e s T a x < / A m o u n t S u b j e c t T o S a l e s T a x > 
+             < A m o u n t S u b j e c t T o S a l e s T a x L b l   E l e m e n t T y p e = " C o l u m n "   E l e m e n t I d = " 3 2 9 3 0 3 2 9 7 "   D a t a T y p e = " L a b e l " > A m o u n t S u b j e c t T o S a l e s T a x L b l < / A m o u n t S u b j e c t T o S a l e s T a x L b l > 
+             < T o t a l A m o u n t I n c l u d i n g V A T   E l e m e n t T y p e = " C o l u m n "   E l e m e n t I d = " 9 1 0 5 1 1 5 7 5 "   D a t a T y p e = " D e c i m a l " > T o t a l A m o u n t I n c l u d i n g V A T < / T o t a l A m o u n t I n c l u d i n g V A T > 
+             < T o t a l E x c l u d i n g V A T T e x t   E l e m e n t T y p e = " C o l u m n "   E l e m e n t I d = " 1 9 2 2 9 4 6 3 1 0 "   D a t a T y p e = " T e x t " > T o t a l E x c l u d i n g V A T T e x t < / T o t a l E x c l u d i n g V A T T e x t > 
+             < T o t a l I n c l u d i n g V A T T e x t   E l e m e n t T y p e = " C o l u m n "   E l e m e n t I d = " 1 2 0 4 0 1 6 3 5 2 "   D a t a T y p e = " T e x t " > T o t a l I n c l u d i n g V A T T e x t < / T o t a l I n c l u d i n g V A T T e x t > 
+             < T o t a l I n v o i c e D i s c o u n t A m o u n t   E l e m e n t T y p e = " C o l u m n "   E l e m e n t I d = " 4 0 2 1 7 7 5 1 "   D a t a T y p e = " D e c i m a l " > T o t a l I n v o i c e D i s c o u n t A m o u n t < / T o t a l I n v o i c e D i s c o u n t A m o u n t > 
+             < T o t a l N e t A m o u n t   E l e m e n t T y p e = " C o l u m n "   E l e m e n t I d = " 4 8 3 1 9 3 3 7 2 "   D a t a T y p e = " D e c i m a l " > T o t a l N e t A m o u n t < / T o t a l N e t A m o u n t > 
+             < T o t a l P a y m e n t D i s c o u n t O n V A T   E l e m e n t T y p e = " C o l u m n "   E l e m e n t I d = " 7 3 6 0 4 1 8 8 6 "   D a t a T y p e = " D e c i m a l " > T o t a l P a y m e n t D i s c o u n t O n V A T < / T o t a l P a y m e n t D i s c o u n t O n V A T > 
+             < T o t a l S u b T o t a l   E l e m e n t T y p e = " C o l u m n "   E l e m e n t I d = " 2 0 9 7 8 7 6 8 0 1 "   D a t a T y p e = " D e c i m a l " > T o t a l S u b T o t a l < / T o t a l S u b T o t a l > 
+             < T o t a l S u b T o t a l M i n u s I n v o i c e D i s c o u n t   E l e m e n t T y p e = " C o l u m n "   E l e m e n t I d = " 7 6 9 4 3 1 8 8 7 "   D a t a T y p e = " D e c i m a l " > T o t a l S u b T o t a l M i n u s I n v o i c e D i s c o u n t < / T o t a l S u b T o t a l M i n u s I n v o i c e D i s c o u n t > 
+             < T o t a l T e x t   E l e m e n t T y p e = " C o l u m n "   E l e m e n t I d = " 2 3 1 9 1 0 5 1 8 "   D a t a T y p e = " T e x t " > T o t a l T e x t < / T o t a l T e x t > 
+             < T o t a l V A T A m o u n t   E l e m e n t T y p e = " C o l u m n "   E l e m e n t I d = " 1 6 2 7 1 0 2 3 2 8 "   D a t a T y p e = " D e c i m a l " > T o t a l V A T A m o u n t < / T o t a l V A T A m o u n t > 
+             < T o t a l V A T A m o u n t L C Y   E l e m e n t T y p e = " C o l u m n "   E l e m e n t I d = " 1 5 0 6 5 7 0 2 1 8 "   D a t a T y p e = " D e c i m a l " > T o t a l V A T A m o u n t L C Y < / T o t a l V A T A m o u n t L C Y > 
+             < T o t a l V A T A m o u n t T e x t   E l e m e n t T y p e = " C o l u m n "   E l e m e n t I d = " 9 7 3 6 6 6 3 3 9 "   D a t a T y p e = " T e x t " > T o t a l V A T A m o u n t T e x t < / T o t a l V A T A m o u n t T e x t > 
+             < T o t a l V A T B a s e L C Y   E l e m e n t T y p e = " C o l u m n "   E l e m e n t I d = " 8 3 4 4 5 0 5 2 1 "   D a t a T y p e = " D e c i m a l " > T o t a l V A T B a s e L C Y < / T o t a l V A T B a s e L C Y > 
+         < / T o t a l s > 
+     < / H e a d e r > 
+ < / N a v W o r d R e p o r t X m l P a r t > 
+</file>
+
 <file path=customXml/itemProps1.xml><?xml version="1.0" encoding="utf-8"?>
 <ds:datastoreItem xmlns:ds="http://schemas.openxmlformats.org/officeDocument/2006/customXml" ds:itemID="{6FC6AE80-DC75-4110-9687-32E2585C9DBF}">
   <ds:schemaRefs>

</xml_diff>